<commit_message>
fix: close typecheck, lint, and redaction regression gaps
Make tick schema apply use the existing migration helper shape, keep
DispatchResult.deferred compatible with existing mocks, and accept
[redacted-token] in structured-log assertions.

Co-authored-by: shenmixingye08-design <shenmixingye08-design@users.noreply.github.com>
</commit_message>
<xml_diff>
--- a/public/samples/weekly-report.docx
+++ b/public/samples/weekly-report.docx
@@ -29,7 +29,7 @@
           <w:sz w:val="18"/>
           <w:szCs w:val="18"/>
         </w:rPr>
-        <w:t xml:space="preserve">2026年8月10日</w:t>
+        <w:t xml:space="preserve">2026年8月22日</w:t>
       </w:r>
     </w:p>
     <w:p>
@@ -83,9 +83,7 @@
     </w:sdt>
     <w:p>
       <w:pPr>
-        <w:pStyle w:val="Heading2"/>
-        <w:keepNext/>
-        <w:spacing w:after="140" w:before="280"/>
+        <w:spacing w:after="120" w:before="200"/>
       </w:pPr>
       <w:r>
         <w:rPr>
@@ -128,7 +126,7 @@
           <w:sz w:val="28"/>
           <w:szCs w:val="28"/>
         </w:rPr>
-        <w:t xml:space="preserve">今週の進捗</w:t>
+        <w:t xml:space="preserve">課題</w:t>
       </w:r>
     </w:p>
     <w:p>
@@ -147,7 +145,7 @@
           <w:sz w:val="22"/>
           <w:szCs w:val="22"/>
         </w:rPr>
-        <w:t xml:space="preserve">SNS投稿文の下書きを3件用意</w:t>
+        <w:t xml:space="preserve">繰り返し作業の手作業時間がまだ長い</w:t>
       </w:r>
     </w:p>
     <w:p>
@@ -166,7 +164,25 @@
           <w:sz w:val="22"/>
           <w:szCs w:val="22"/>
         </w:rPr>
-        <w:t xml:space="preserve">顧客フォローメールの文面を整備</w:t>
+        <w:t xml:space="preserve">確認待ちの案件が2件残っている</w:t>
+      </w:r>
+    </w:p>
+    <w:p>
+      <w:pPr>
+        <w:pStyle w:val="Heading2"/>
+        <w:keepNext/>
+        <w:spacing w:after="140" w:before="280"/>
+      </w:pPr>
+      <w:r>
+        <w:rPr>
+          <w:rFonts w:ascii="Calibri" w:eastAsia="Yu Gothic" w:hAnsi="Calibri"/>
+          <w:b/>
+          <w:bCs/>
+          <w:color w:val="2F3E4E"/>
+          <w:sz w:val="28"/>
+          <w:szCs w:val="28"/>
+        </w:rPr>
+        <w:t xml:space="preserve">今週の進捗</w:t>
       </w:r>
     </w:p>
     <w:p>
@@ -185,25 +201,7 @@
           <w:sz w:val="22"/>
           <w:szCs w:val="22"/>
         </w:rPr>
-        <w:t xml:space="preserve">来週の提案資料アウトラインを作成</w:t>
-      </w:r>
-    </w:p>
-    <w:p>
-      <w:pPr>
-        <w:pStyle w:val="Heading2"/>
-        <w:keepNext/>
-        <w:spacing w:after="140" w:before="280"/>
-      </w:pPr>
-      <w:r>
-        <w:rPr>
-          <w:rFonts w:ascii="Calibri" w:eastAsia="Yu Gothic" w:hAnsi="Calibri"/>
-          <w:b/>
-          <w:bCs/>
-          <w:color w:val="2F3E4E"/>
-          <w:sz w:val="28"/>
-          <w:szCs w:val="28"/>
-        </w:rPr>
-        <w:t xml:space="preserve">課題</w:t>
+        <w:t xml:space="preserve">SNS投稿文の下書きを3件用意</w:t>
       </w:r>
     </w:p>
     <w:p>
@@ -222,7 +220,7 @@
           <w:sz w:val="22"/>
           <w:szCs w:val="22"/>
         </w:rPr>
-        <w:t xml:space="preserve">繰り返し作業の手作業時間がまだ長い</w:t>
+        <w:t xml:space="preserve">顧客フォローメールの文面を整備</w:t>
       </w:r>
     </w:p>
     <w:p>
@@ -241,7 +239,7 @@
           <w:sz w:val="22"/>
           <w:szCs w:val="22"/>
         </w:rPr>
-        <w:t xml:space="preserve">確認待ちの案件が2件残っている</w:t>
+        <w:t xml:space="preserve">来週の提案資料アウトラインを作成</w:t>
       </w:r>
     </w:p>
     <w:p>
@@ -419,9 +417,29 @@
         <w:sz w:val="18"/>
         <w:szCs w:val="18"/>
       </w:rPr>
-      <w:t xml:space="preserve"/>
       <w:fldChar w:fldCharType="begin"/>
       <w:instrText xml:space="preserve">PAGE</w:instrText>
+      <w:fldChar w:fldCharType="separate"/>
+      <w:fldChar w:fldCharType="end"/>
+    </w:r>
+    <w:r>
+      <w:rPr>
+        <w:rFonts w:ascii="Calibri" w:eastAsia="Yu Gothic" w:hAnsi="Calibri"/>
+        <w:color w:val="666666"/>
+        <w:sz w:val="18"/>
+        <w:szCs w:val="18"/>
+      </w:rPr>
+      <w:t xml:space="preserve"> / </w:t>
+    </w:r>
+    <w:r>
+      <w:rPr>
+        <w:rFonts w:ascii="Calibri" w:eastAsia="Yu Gothic" w:hAnsi="Calibri"/>
+        <w:color w:val="666666"/>
+        <w:sz w:val="18"/>
+        <w:szCs w:val="18"/>
+      </w:rPr>
+      <w:fldChar w:fldCharType="begin"/>
+      <w:instrText xml:space="preserve">NUMPAGES</w:instrText>
       <w:fldChar w:fldCharType="separate"/>
       <w:fldChar w:fldCharType="end"/>
     </w:r>

</xml_diff>